<commit_message>
publish student projects (Fall 2026) 2026-09-22 19:09
</commit_message>
<xml_diff>
--- a/Games/pawgress.docx
+++ b/Games/pawgress.docx
@@ -2676,13 +2676,13 @@
         <w:rPr>
           <w:b/>
         </w:rPr>
-        <w:t xml:space="preserve">Recommended composition:</w:t>
-      </w:r>
-      <w:r>
-        <w:t xml:space="preserve"> </w:t>
-      </w:r>
-      <w:r>
-        <w:t xml:space="preserve">6 CS + 1 Design + 2 Art (9) — Pawgress lives on</w:t>
+        <w:t xml:space="preserve">Team composition (set by instructor):</w:t>
+      </w:r>
+      <w:r>
+        <w:t xml:space="preserve"> </w:t>
+      </w:r>
+      <w:r>
+        <w:t xml:space="preserve">6 CS + 1 Design + 0 Art (7) — Pawgress lives on</w:t>
       </w:r>
       <w:r>
         <w:t xml:space="preserve"> </w:t>
@@ -2694,22 +2694,52 @@
         <w:t xml:space="preserve">charm</w:t>
       </w:r>
       <w:r>
-        <w:t xml:space="preserve">: the pet (growth stages, moods, expression, a customisation-item catalogue) plus the Singapore map/landmarks and the reward art are a large art surface, so two artists carry it; a single designer owns the progression/reward economy, the exploration design and the daily-goal/streak</w:t>
-      </w:r>
-      <w:r>
-        <w:t xml:space="preserve"> </w:t>
-      </w:r>
-      <w:r>
-        <w:rPr>
-          <w:b/>
-        </w:rPr>
-        <w:t xml:space="preserve">retention loop</w:t>
-      </w:r>
-      <w:r>
-        <w:t xml:space="preserve"> </w:t>
-      </w:r>
-      <w:r>
-        <w:t xml:space="preserve">(with the wellness ethics line) (rules: min 1 Design mandated, max 9 total, D+A ≤ 3; see</w:t>
+        <w:t xml:space="preserve"> </w:t>
+      </w:r>
+      <w:r>
+        <w:t xml:space="preserve">(the pet — growth stages, moods, expression, a customisation-item catalogue — plus the Singapore map/landmarks and the reward art), which is a large art surface that now has</w:t>
+      </w:r>
+      <w:r>
+        <w:t xml:space="preserve"> </w:t>
+      </w:r>
+      <w:r>
+        <w:rPr>
+          <w:b/>
+        </w:rPr>
+        <w:t xml:space="preserve">no artist</w:t>
+      </w:r>
+      <w:r>
+        <w:t xml:space="preserve">, so the single designer owns the progression/reward economy and the exploration/retention design</w:t>
+      </w:r>
+      <w:r>
+        <w:t xml:space="preserve"> </w:t>
+      </w:r>
+      <w:r>
+        <w:rPr>
+          <w:i/>
+        </w:rPr>
+        <w:t xml:space="preserve">and</w:t>
+      </w:r>
+      <w:r>
+        <w:t xml:space="preserve"> </w:t>
+      </w:r>
+      <w:r>
+        <w:t xml:space="preserve">takes the</w:t>
+      </w:r>
+      <w:r>
+        <w:t xml:space="preserve"> </w:t>
+      </w:r>
+      <w:r>
+        <w:rPr>
+          <w:b/>
+        </w:rPr>
+        <w:t xml:space="preserve">D11 conditional</w:t>
+      </w:r>
+      <w:r>
+        <w:t xml:space="preserve"> </w:t>
+      </w:r>
+      <w:r>
+        <w:t xml:space="preserve">as a real graded Design goal each milestone (M1 Art Proof of Concept / M2 Art Implementation Quality — the last Design goal each milestone), which consumes one Design+UI slot per milestone (rules: min 1 Design mandated, max 9 total, D+A ≤ 3; see</w:t>
       </w:r>
       <w:r>
         <w:t xml:space="preserve"> </w:t>
@@ -2721,7 +2751,22 @@
         <w:t xml:space="preserve">team-formation.pdf</w:t>
       </w:r>
       <w:r>
-        <w:t xml:space="preserve">). If the retention/economy design outgrows one designer, trade the 2nd artist for a 2nd designer.</w:t>
+        <w:t xml:space="preserve">).</w:t>
+      </w:r>
+      <w:r>
+        <w:t xml:space="preserve"> </w:t>
+      </w:r>
+      <w:r>
+        <w:rPr>
+          <w:b/>
+        </w:rPr>
+        <w:t xml:space="preserve">Art-risk flag:</w:t>
+      </w:r>
+      <w:r>
+        <w:t xml:space="preserve"> </w:t>
+      </w:r>
+      <w:r>
+        <w:t xml:space="preserve">a pet-charm app is very art-forward (pet states + customisation + map/landmarks + rewards), so 0 artists is a serious risk — scope the pet/customisation set hard and lean on a reusable cosy style under D11, or reconsider adding an artist within the D+A ≤ 3 cap (a solo designer + 0 artists is the case the design pool flags, and squeezes the designer's retention/balance goals).</w:t>
       </w:r>
       <w:r>
         <w:t xml:space="preserve"> </w:t>
@@ -2804,7 +2849,7 @@
         <w:pStyle w:val="Compact"/>
       </w:pPr>
       <w:r>
-        <w:t xml:space="preserve">M1D9 Engagement &amp; Retention Loop Design (the daily-goal / streak / reward loop, with the ethics line explicit — engagement must serve the user's health, never dark-pattern or guilt-trip)</w:t>
+        <w:t xml:space="preserve">M1D11 Art Proof of Concept *(conditional — no artist; Design-owned)* — the cosy visual direction: the pet (growth stages, moods, customisation-item look), the Singapore map/landmarks and the reward art; 2 mockups. *(Replaces the M1D9 retention-design slot the artist's absence consumes.)*</w:t>
       </w:r>
     </w:p>
     <w:p>
@@ -2843,7 +2888,7 @@
         <w:pStyle w:val="Compact"/>
       </w:pPr>
       <w:r>
-        <w:t xml:space="preserve">M2D3 Systems Balance &amp; Tuning — Data-Driven (the step→EXP→reward curve, streak pacing and customisation economy via the team's JSON)</w:t>
+        <w:t xml:space="preserve">M2D11 Art Implementation Quality *(conditional — no artist; Design-owned)* — the pet (states/customisation), the map/landmarks, the rewards and the UI implemented in-engine, no placeholders.</w:t>
       </w:r>
     </w:p>
     <w:p>
@@ -2930,85 +2975,13 @@
         <w:rPr>
           <w:b/>
         </w:rPr>
-        <w:t xml:space="preserve">Art M1:</w:t>
-      </w:r>
-      <w:r>
-        <w:t xml:space="preserve"> </w:t>
-      </w:r>
-      <w:r>
-        <w:t xml:space="preserve">2 artists justified (pet growth stages + customisation catalogue + map/landmarks)</w:t>
-      </w:r>
-    </w:p>
-    <w:p>
-      <w:pPr>
-        <w:numPr>
-          <w:ilvl w:val="1"/>
-          <w:numId w:val="1023"/>
-        </w:numPr>
-        <w:pStyle w:val="Compact"/>
-      </w:pPr>
-      <w:r>
-        <w:t xml:space="preserve">M1A1 ⭐ Art Bible / Proof of Concept (the cosy visual direction — palette, the pet's charm, the Singapore-map style)</w:t>
-      </w:r>
-    </w:p>
-    <w:p>
-      <w:pPr>
-        <w:numPr>
-          <w:ilvl w:val="1"/>
-          <w:numId w:val="1023"/>
-        </w:numPr>
-        <w:pStyle w:val="Compact"/>
-      </w:pPr>
-      <w:r>
-        <w:t xml:space="preserve">M1A2 Character Concepts &amp; Model Sheets (the pet across growth stages + mood/expression sheets)</w:t>
-      </w:r>
-    </w:p>
-    <w:p>
-      <w:pPr>
-        <w:numPr>
-          <w:ilvl w:val="1"/>
-          <w:numId w:val="1023"/>
-        </w:numPr>
-        <w:pStyle w:val="Compact"/>
-      </w:pPr>
-      <w:r>
-        <w:t xml:space="preserve">M1A3 Environment, Props &amp; VFX Concepts (the Singapore map areas/landmarks + reward/exploration VFX concepts)</w:t>
-      </w:r>
-    </w:p>
-    <w:p>
-      <w:pPr>
-        <w:numPr>
-          <w:ilvl w:val="1"/>
-          <w:numId w:val="1023"/>
-        </w:numPr>
-        <w:pStyle w:val="Compact"/>
-      </w:pPr>
-      <w:r>
-        <w:t xml:space="preserve">M1A4 UI Art Concepts &amp; Typography (pet-care home, map view, goal/streak HUD, reward screens)</w:t>
-      </w:r>
-    </w:p>
-    <w:p>
-      <w:pPr>
-        <w:numPr>
-          <w:ilvl w:val="1"/>
-          <w:numId w:val="1023"/>
-        </w:numPr>
-        <w:pStyle w:val="Compact"/>
-      </w:pPr>
-      <w:r>
-        <w:t xml:space="preserve">M1A5 Animation Foundations (pet idle/grow/react + customisation swaps)</w:t>
-      </w:r>
-    </w:p>
-    <w:p>
-      <w:pPr>
-        <w:numPr>
-          <w:ilvl w:val="1"/>
-          <w:numId w:val="1023"/>
-        </w:numPr>
-        <w:pStyle w:val="Compact"/>
-      </w:pPr>
-      <w:r>
-        <w:t xml:space="preserve">M1A6 Early Asset Production — Prototype Support</w:t>
+        <w:t xml:space="preserve">Art:</w:t>
+      </w:r>
+      <w:r>
+        <w:t xml:space="preserve"> </w:t>
+      </w:r>
+      <w:r>
+        <w:t xml:space="preserve">0 artists — the large art surface (the pet across growth stages + customisation, the Singapore map/landmarks, and the reward art) is covered by the D11 conditionals, taken as Design goals by the single designer (see Design M1/M2). A pet-charm app is very art-forward, so 0 artists is a serious risk — scope the pet/customisation set hard and lean on a reusable cosy style.</w:t>
       </w:r>
     </w:p>
     <w:p>
@@ -3023,79 +2996,31 @@
         <w:rPr>
           <w:b/>
         </w:rPr>
-        <w:t xml:space="preserve">Art M2:</w:t>
-      </w:r>
-    </w:p>
-    <w:p>
-      <w:pPr>
-        <w:numPr>
-          <w:ilvl w:val="1"/>
-          <w:numId w:val="1024"/>
-        </w:numPr>
-        <w:pStyle w:val="Compact"/>
-      </w:pPr>
-      <w:r>
-        <w:t xml:space="preserve">M2A1 ⭐ Critical Asset Production &amp; In-Engine Visual Quality</w:t>
-      </w:r>
-    </w:p>
-    <w:p>
-      <w:pPr>
-        <w:numPr>
-          <w:ilvl w:val="1"/>
-          <w:numId w:val="1024"/>
-        </w:numPr>
-        <w:pStyle w:val="Compact"/>
-      </w:pPr>
-      <w:r>
-        <w:t xml:space="preserve">M2A2 Character Animation — Extensive (the pet's moods, reactions and growth transitions)</w:t>
-      </w:r>
-    </w:p>
-    <w:p>
-      <w:pPr>
-        <w:numPr>
-          <w:ilvl w:val="1"/>
-          <w:numId w:val="1024"/>
-        </w:numPr>
-        <w:pStyle w:val="Compact"/>
-      </w:pPr>
-      <w:r>
-        <w:t xml:space="preserve">M2A3 Environment Alive — Ambient Animation &amp; Layering (living Singapore-map areas/landmarks)</w:t>
-      </w:r>
-    </w:p>
-    <w:p>
-      <w:pPr>
-        <w:numPr>
-          <w:ilvl w:val="1"/>
-          <w:numId w:val="1024"/>
-        </w:numPr>
-        <w:pStyle w:val="Compact"/>
-      </w:pPr>
-      <w:r>
-        <w:t xml:space="preserve">M2A4 UI Art — States &amp; Feedback (goal-met / streak / reward-unlocked / region-revealed states)</w:t>
-      </w:r>
-    </w:p>
-    <w:p>
-      <w:pPr>
-        <w:numPr>
-          <w:ilvl w:val="1"/>
-          <w:numId w:val="1024"/>
-        </w:numPr>
-        <w:pStyle w:val="Compact"/>
-      </w:pPr>
-      <w:r>
-        <w:t xml:space="preserve">M2A5 VFX — Critical Effects &amp; Transitions (level-up, reward and exploration-reveal effects)</w:t>
-      </w:r>
-    </w:p>
-    <w:p>
-      <w:pPr>
-        <w:numPr>
-          <w:ilvl w:val="1"/>
-          <w:numId w:val="1024"/>
-        </w:numPr>
-        <w:pStyle w:val="Compact"/>
-      </w:pPr>
-      <w:r>
-        <w:t xml:space="preserve">M2A6 Cutscenes &amp; Storyboards (the pet's intro / milestone moments)</w:t>
+        <w:t xml:space="preserve">TEAM M1:</w:t>
+      </w:r>
+    </w:p>
+    <w:p>
+      <w:pPr>
+        <w:numPr>
+          <w:ilvl w:val="1"/>
+          <w:numId w:val="1023"/>
+        </w:numPr>
+        <w:pStyle w:val="Compact"/>
+      </w:pPr>
+      <w:r>
+        <w:t xml:space="preserve">M1TA1 ⭐ Overall Audio Experience — initial BGM/SFX from the week-5 needs list present &amp; working in the prototype (cosy BGM, step/goal-met, pet-happy, reward and region-reveal cues), suitable and correctly triggered.</w:t>
+      </w:r>
+    </w:p>
+    <w:p>
+      <w:pPr>
+        <w:numPr>
+          <w:ilvl w:val="1"/>
+          <w:numId w:val="1023"/>
+        </w:numPr>
+        <w:pStyle w:val="Compact"/>
+      </w:pPr>
+      <w:r>
+        <w:t xml:space="preserve">M1TA2 ⭐ Audio Engine Functionality — data-driven audio pipeline (add/replace files without recompiling) + reliable multi-channel playback.</w:t>
       </w:r>
     </w:p>
     <w:p>
@@ -3110,45 +3035,6 @@
         <w:rPr>
           <w:b/>
         </w:rPr>
-        <w:t xml:space="preserve">TEAM M1:</w:t>
-      </w:r>
-    </w:p>
-    <w:p>
-      <w:pPr>
-        <w:numPr>
-          <w:ilvl w:val="1"/>
-          <w:numId w:val="1025"/>
-        </w:numPr>
-        <w:pStyle w:val="Compact"/>
-      </w:pPr>
-      <w:r>
-        <w:t xml:space="preserve">M1TA1 ⭐ Overall Audio Experience — initial BGM/SFX from the week-5 needs list present &amp; working in the prototype (cosy BGM, step/goal-met, pet-happy, reward and region-reveal cues), suitable and correctly triggered.</w:t>
-      </w:r>
-    </w:p>
-    <w:p>
-      <w:pPr>
-        <w:numPr>
-          <w:ilvl w:val="1"/>
-          <w:numId w:val="1025"/>
-        </w:numPr>
-        <w:pStyle w:val="Compact"/>
-      </w:pPr>
-      <w:r>
-        <w:t xml:space="preserve">M1TA2 ⭐ Audio Engine Functionality — data-driven audio pipeline (add/replace files without recompiling) + reliable multi-channel playback.</w:t>
-      </w:r>
-    </w:p>
-    <w:p>
-      <w:pPr>
-        <w:numPr>
-          <w:ilvl w:val="0"/>
-          <w:numId w:val="1018"/>
-        </w:numPr>
-        <w:pStyle w:val="Compact"/>
-      </w:pPr>
-      <w:r>
-        <w:rPr>
-          <w:b/>
-        </w:rPr>
         <w:t xml:space="preserve">TEAM M2:</w:t>
       </w:r>
     </w:p>
@@ -3156,7 +3042,7 @@
       <w:pPr>
         <w:numPr>
           <w:ilvl w:val="1"/>
-          <w:numId w:val="1026"/>
+          <w:numId w:val="1024"/>
         </w:numPr>
         <w:pStyle w:val="Compact"/>
       </w:pPr>
@@ -3168,7 +3054,7 @@
       <w:pPr>
         <w:numPr>
           <w:ilvl w:val="1"/>
-          <w:numId w:val="1026"/>
+          <w:numId w:val="1024"/>
         </w:numPr>
         <w:pStyle w:val="Compact"/>
       </w:pPr>
@@ -3180,7 +3066,7 @@
       <w:pPr>
         <w:numPr>
           <w:ilvl w:val="1"/>
-          <w:numId w:val="1026"/>
+          <w:numId w:val="1024"/>
         </w:numPr>
         <w:pStyle w:val="Compact"/>
       </w:pPr>
@@ -3667,12 +3553,6 @@
     <w:abstractNumId w:val="991"/>
   </w:num>
   <w:num w:numId="1024">
-    <w:abstractNumId w:val="991"/>
-  </w:num>
-  <w:num w:numId="1025">
-    <w:abstractNumId w:val="991"/>
-  </w:num>
-  <w:num w:numId="1026">
     <w:abstractNumId w:val="991"/>
   </w:num>
 </w:numbering>

</xml_diff>